<commit_message>
added import to Eclipse slide
</commit_message>
<xml_diff>
--- a/EG 03-Java Basics - Methods.docx
+++ b/EG 03-Java Basics - Methods.docx
@@ -376,12 +376,14 @@
       <w:r>
         <w:t xml:space="preserve"> </w:t>
       </w:r>
+      <w:proofErr w:type="spellStart"/>
       <w:r>
         <w:rPr>
           <w:b/>
         </w:rPr>
         <w:t>getInt</w:t>
       </w:r>
+      <w:proofErr w:type="spellEnd"/>
       <w:r>
         <w:t>(</w:t>
       </w:r>
@@ -547,6 +549,7 @@
         </w:rPr>
         <w:t xml:space="preserve"> </w:t>
       </w:r>
+      <w:proofErr w:type="spellStart"/>
       <w:r>
         <w:rPr>
           <w:rFonts w:ascii="Consolas" w:eastAsiaTheme="minorEastAsia" w:hAnsi="Consolas" w:cs="Consolas"/>
@@ -560,7 +563,15 @@
           <w:rFonts w:ascii="Consolas" w:eastAsiaTheme="minorEastAsia" w:hAnsi="Consolas" w:cs="Consolas"/>
           <w:szCs w:val="20"/>
         </w:rPr>
-        <w:t>.nextInt();</w:t>
+        <w:t>.nextInt</w:t>
+      </w:r>
+      <w:proofErr w:type="spellEnd"/>
+      <w:r>
+        <w:rPr>
+          <w:rFonts w:ascii="Consolas" w:eastAsiaTheme="minorEastAsia" w:hAnsi="Consolas" w:cs="Consolas"/>
+          <w:szCs w:val="20"/>
+        </w:rPr>
+        <w:t>();</w:t>
       </w:r>
       <w:r>
         <w:rPr>
@@ -621,6 +632,7 @@
       <w:r>
         <w:t xml:space="preserve"> </w:t>
       </w:r>
+      <w:proofErr w:type="spellStart"/>
       <w:r>
         <w:rPr>
           <w:b/>
@@ -628,6 +640,7 @@
         </w:rPr>
         <w:t>getString</w:t>
       </w:r>
+      <w:proofErr w:type="spellEnd"/>
       <w:r>
         <w:t>(</w:t>
       </w:r>
@@ -652,11 +665,19 @@
       <w:r>
         <w:t xml:space="preserve">This method is similar to the </w:t>
       </w:r>
+      <w:proofErr w:type="spellStart"/>
       <w:r>
         <w:rPr>
           <w:b/>
         </w:rPr>
-        <w:t xml:space="preserve">getInt() </w:t>
+        <w:t>getInt</w:t>
+      </w:r>
+      <w:proofErr w:type="spellEnd"/>
+      <w:r>
+        <w:rPr>
+          <w:b/>
+        </w:rPr>
+        <w:t xml:space="preserve">() </w:t>
       </w:r>
       <w:r>
         <w:t>method</w:t>
@@ -668,15 +689,18 @@
         <w:tab/>
         <w:t xml:space="preserve">the </w:t>
       </w:r>
+      <w:proofErr w:type="spellStart"/>
       <w:r>
         <w:rPr>
           <w:b/>
         </w:rPr>
         <w:t>s.nextInt</w:t>
       </w:r>
+      <w:proofErr w:type="spellEnd"/>
       <w:r>
         <w:t xml:space="preserve"> to </w:t>
       </w:r>
+      <w:proofErr w:type="spellStart"/>
       <w:r>
         <w:rPr>
           <w:rFonts w:ascii="Consolas" w:eastAsiaTheme="minorEastAsia" w:hAnsi="Consolas" w:cs="Consolas"/>
@@ -692,7 +716,16 @@
           <w:b/>
           <w:szCs w:val="20"/>
         </w:rPr>
-        <w:t>.nextLine();</w:t>
+        <w:t>.nextLine</w:t>
+      </w:r>
+      <w:proofErr w:type="spellEnd"/>
+      <w:r>
+        <w:rPr>
+          <w:rFonts w:ascii="Consolas" w:eastAsiaTheme="minorEastAsia" w:hAnsi="Consolas" w:cs="Consolas"/>
+          <w:b/>
+          <w:szCs w:val="20"/>
+        </w:rPr>
+        <w:t>();</w:t>
       </w:r>
       <w:r>
         <w:rPr>
@@ -892,7 +925,14 @@
           <w:b/>
           <w:bCs/>
         </w:rPr>
-        <w:t>brussel sprouts</w:t>
+        <w:t>Brussel</w:t>
+      </w:r>
+      <w:r>
+        <w:rPr>
+          <w:b/>
+          <w:bCs/>
+        </w:rPr>
+        <w:t xml:space="preserve"> sprouts</w:t>
       </w:r>
       <w:r>
         <w:t xml:space="preserve"> they want.</w:t>
@@ -942,6 +982,7 @@
       <w:r>
         <w:t xml:space="preserve">Create a method called </w:t>
       </w:r>
+      <w:proofErr w:type="spellStart"/>
       <w:r>
         <w:rPr>
           <w:rFonts w:ascii="Lucida Console" w:eastAsia="Lucida Console" w:hAnsi="Lucida Console" w:cs="Lucida Console"/>
@@ -949,6 +990,7 @@
         </w:rPr>
         <w:t>theLunchQueue</w:t>
       </w:r>
+      <w:proofErr w:type="spellEnd"/>
       <w:r>
         <w:t xml:space="preserve"> </w:t>
       </w:r>
@@ -970,12 +1012,14 @@
       <w:r>
         <w:t xml:space="preserve">Call the </w:t>
       </w:r>
+      <w:proofErr w:type="spellStart"/>
       <w:r>
         <w:rPr>
           <w:b/>
         </w:rPr>
         <w:t>getString</w:t>
       </w:r>
+      <w:proofErr w:type="spellEnd"/>
       <w:r>
         <w:t>() method to display the following</w:t>
       </w:r>
@@ -1013,12 +1057,14 @@
       <w:r>
         <w:t xml:space="preserve">And get the answer into a variable called </w:t>
       </w:r>
+      <w:proofErr w:type="spellStart"/>
       <w:r>
         <w:rPr>
           <w:b/>
         </w:rPr>
         <w:t>mainCourse</w:t>
       </w:r>
+      <w:proofErr w:type="spellEnd"/>
       <w:r>
         <w:t>.</w:t>
       </w:r>
@@ -1034,12 +1080,14 @@
       <w:r>
         <w:t xml:space="preserve">Use the </w:t>
       </w:r>
+      <w:proofErr w:type="spellStart"/>
       <w:r>
         <w:rPr>
           <w:b/>
         </w:rPr>
         <w:t>getInt</w:t>
       </w:r>
+      <w:proofErr w:type="spellEnd"/>
       <w:r>
         <w:t>() method to display the following prompts and capture the values in suitable variable names.</w:t>
       </w:r>
@@ -1102,24 +1150,28 @@
         </w:rPr>
         <w:t xml:space="preserve"> with </w:t>
       </w:r>
+      <w:proofErr w:type="spellStart"/>
       <w:r>
         <w:rPr>
           <w:bCs/>
         </w:rPr>
         <w:t>yy</w:t>
       </w:r>
+      <w:proofErr w:type="spellEnd"/>
       <w:r>
         <w:rPr>
           <w:b/>
         </w:rPr>
         <w:t xml:space="preserve"> roast potatoes and </w:t>
       </w:r>
+      <w:proofErr w:type="spellStart"/>
       <w:r>
         <w:rPr>
           <w:bCs/>
         </w:rPr>
         <w:t>zz</w:t>
       </w:r>
+      <w:proofErr w:type="spellEnd"/>
       <w:r>
         <w:rPr>
           <w:b/>
@@ -1143,20 +1195,36 @@
         <w:rPr>
           <w:iCs/>
         </w:rPr>
-        <w:t>xx, yy</w:t>
-      </w:r>
+        <w:t xml:space="preserve">xx, </w:t>
+      </w:r>
+      <w:proofErr w:type="spellStart"/>
       <w:r>
         <w:rPr>
           <w:iCs/>
         </w:rPr>
+        <w:t>yy</w:t>
+      </w:r>
+      <w:proofErr w:type="spellEnd"/>
+      <w:r>
+        <w:rPr>
+          <w:iCs/>
+        </w:rPr>
         <w:t>,</w:t>
       </w:r>
       <w:r>
         <w:rPr>
           <w:iCs/>
         </w:rPr>
-        <w:t xml:space="preserve"> and zz</w:t>
-      </w:r>
+        <w:t xml:space="preserve"> and </w:t>
+      </w:r>
+      <w:proofErr w:type="spellStart"/>
+      <w:r>
+        <w:rPr>
+          <w:iCs/>
+        </w:rPr>
+        <w:t>zz</w:t>
+      </w:r>
+      <w:proofErr w:type="spellEnd"/>
       <w:r>
         <w:t xml:space="preserve"> with actual values of course! </w:t>
       </w:r>
@@ -1172,12 +1240,21 @@
       <w:r>
         <w:t xml:space="preserve">Test your code by calling </w:t>
       </w:r>
+      <w:proofErr w:type="spellStart"/>
       <w:r>
         <w:rPr>
           <w:rFonts w:ascii="Lucida Console" w:eastAsia="Lucida Console" w:hAnsi="Lucida Console" w:cs="Lucida Console"/>
           <w:b/>
         </w:rPr>
-        <w:t xml:space="preserve">theLunchQueue() method </w:t>
+        <w:t>theLunchQueue</w:t>
+      </w:r>
+      <w:proofErr w:type="spellEnd"/>
+      <w:r>
+        <w:rPr>
+          <w:rFonts w:ascii="Lucida Console" w:eastAsia="Lucida Console" w:hAnsi="Lucida Console" w:cs="Lucida Console"/>
+          <w:b/>
+        </w:rPr>
+        <w:t xml:space="preserve">() method </w:t>
       </w:r>
       <w:r>
         <w:t xml:space="preserve">from main(). </w:t>
@@ -1246,12 +1323,14 @@
         </w:rPr>
         <w:t xml:space="preserve">static void </w:t>
       </w:r>
+      <w:proofErr w:type="spellStart"/>
       <w:r>
         <w:rPr>
           <w:rFonts w:ascii="Consolas" w:eastAsia="Lucida Console" w:hAnsi="Consolas" w:cs="Lucida Console"/>
         </w:rPr>
         <w:t>convertInputToStonesPounds</w:t>
       </w:r>
+      <w:proofErr w:type="spellEnd"/>
       <w:r>
         <w:t>(int pounds).</w:t>
       </w:r>
@@ -1357,12 +1436,14 @@
         </w:rPr>
         <w:t xml:space="preserve">static void </w:t>
       </w:r>
+      <w:proofErr w:type="spellStart"/>
       <w:r>
         <w:rPr>
           <w:rFonts w:ascii="Consolas" w:eastAsia="Lucida Console" w:hAnsi="Consolas" w:cs="Lucida Console"/>
         </w:rPr>
         <w:t>convertKgsToStonesPounds</w:t>
       </w:r>
+      <w:proofErr w:type="spellEnd"/>
       <w:r>
         <w:t>(int kg</w:t>
       </w:r>
@@ -1425,12 +1506,14 @@
       <w:r>
         <w:t xml:space="preserve">onvert the Kg to pounds and then call </w:t>
       </w:r>
+      <w:proofErr w:type="spellStart"/>
       <w:r>
         <w:rPr>
           <w:rFonts w:ascii="Lucida Console" w:eastAsia="Lucida Console" w:hAnsi="Lucida Console" w:cs="Lucida Console"/>
         </w:rPr>
         <w:t>convertInputToStonesPounds</w:t>
       </w:r>
+      <w:proofErr w:type="spellEnd"/>
       <w:r>
         <w:t>(int kg)</w:t>
       </w:r>
@@ -1525,6 +1608,7 @@
       <w:r>
         <w:t xml:space="preserve">Copy the </w:t>
       </w:r>
+      <w:proofErr w:type="spellStart"/>
       <w:r>
         <w:rPr>
           <w:b/>
@@ -1532,9 +1616,11 @@
         </w:rPr>
         <w:t>getInt</w:t>
       </w:r>
+      <w:proofErr w:type="spellEnd"/>
       <w:r>
         <w:t xml:space="preserve"> and </w:t>
       </w:r>
+      <w:proofErr w:type="spellStart"/>
       <w:r>
         <w:rPr>
           <w:b/>
@@ -1542,6 +1628,7 @@
         </w:rPr>
         <w:t>getString</w:t>
       </w:r>
+      <w:proofErr w:type="spellEnd"/>
       <w:r>
         <w:t xml:space="preserve"> methods to the Utils class.</w:t>
       </w:r>
@@ -1605,6 +1692,7 @@
       <w:r>
         <w:t xml:space="preserve">Back in the </w:t>
       </w:r>
+      <w:proofErr w:type="spellStart"/>
       <w:r>
         <w:rPr>
           <w:rFonts w:ascii="Lucida Console" w:eastAsia="Lucida Console" w:hAnsi="Lucida Console" w:cs="Lucida Console"/>
@@ -1612,6 +1700,7 @@
         </w:rPr>
         <w:t>theLunchQueue</w:t>
       </w:r>
+      <w:proofErr w:type="spellEnd"/>
       <w:r>
         <w:t xml:space="preserve"> method, create an instance of </w:t>
       </w:r>
@@ -1629,7 +1718,23 @@
         <w:t xml:space="preserve"> </w:t>
       </w:r>
       <w:r>
-        <w:t>class and use it to call the getInt() and getString() methods like:</w:t>
+        <w:t xml:space="preserve">class and use it to call the </w:t>
+      </w:r>
+      <w:proofErr w:type="spellStart"/>
+      <w:r>
+        <w:t>getInt</w:t>
+      </w:r>
+      <w:proofErr w:type="spellEnd"/>
+      <w:r>
+        <w:t xml:space="preserve">() and </w:t>
+      </w:r>
+      <w:proofErr w:type="spellStart"/>
+      <w:r>
+        <w:t>getString</w:t>
+      </w:r>
+      <w:proofErr w:type="spellEnd"/>
+      <w:r>
+        <w:t>() methods like:</w:t>
       </w:r>
     </w:p>
     <w:p>
@@ -1650,6 +1755,7 @@
       <w:r>
         <w:t xml:space="preserve"> </w:t>
       </w:r>
+      <w:proofErr w:type="spellStart"/>
       <w:r>
         <w:rPr>
           <w:b/>
@@ -1657,6 +1763,7 @@
         </w:rPr>
         <w:t>utils</w:t>
       </w:r>
+      <w:proofErr w:type="spellEnd"/>
       <w:r>
         <w:t xml:space="preserve"> = </w:t>
       </w:r>
@@ -1690,8 +1797,17 @@
         <w:t>int</w:t>
       </w:r>
       <w:r>
-        <w:t xml:space="preserve"> potatos = </w:t>
-      </w:r>
+        <w:t xml:space="preserve"> </w:t>
+      </w:r>
+      <w:proofErr w:type="spellStart"/>
+      <w:r>
+        <w:t>potatos</w:t>
+      </w:r>
+      <w:proofErr w:type="spellEnd"/>
+      <w:r>
+        <w:t xml:space="preserve"> = </w:t>
+      </w:r>
+      <w:proofErr w:type="spellStart"/>
       <w:r>
         <w:rPr>
           <w:b/>
@@ -1709,6 +1825,7 @@
         </w:rPr>
         <w:t>getInt</w:t>
       </w:r>
+      <w:proofErr w:type="spellEnd"/>
       <w:r>
         <w:t>(“</w:t>
       </w:r>
@@ -2075,9 +2192,11 @@
     <w:r>
       <w:fldChar w:fldCharType="separate"/>
     </w:r>
+    <w:proofErr w:type="spellStart"/>
     <w:r>
       <w:t>i</w:t>
     </w:r>
+    <w:proofErr w:type="spellEnd"/>
     <w:r>
       <w:fldChar w:fldCharType="end"/>
     </w:r>
@@ -7668,25 +7787,16 @@
 </file>
 
 <file path=customXml/item1.xml><?xml version="1.0" encoding="utf-8"?>
-<b:Sources xmlns:b="http://schemas.openxmlformats.org/officeDocument/2006/bibliography" xmlns="http://schemas.openxmlformats.org/officeDocument/2006/bibliography" SelectedStyle="\APASixthEditionOfficeOnline.xsl" StyleName="APA" Version="6"/>
-</file>
-
-<file path=customXml/item2.xml><?xml version="1.0" encoding="utf-8"?>
 <p:properties xmlns:p="http://schemas.microsoft.com/office/2006/metadata/properties" xmlns:xsi="http://www.w3.org/2001/XMLSchema-instance" xmlns:pc="http://schemas.microsoft.com/office/infopath/2007/PartnerControls">
   <documentManagement/>
 </p:properties>
 </file>
 
-<file path=customXml/item3.xml><?xml version="1.0" encoding="utf-8"?>
-<?mso-contentType ?>
-<FormTemplates xmlns="http://schemas.microsoft.com/sharepoint/v3/contenttype/forms">
-  <Display>DocumentLibraryForm</Display>
-  <Edit>DocumentLibraryForm</Edit>
-  <New>DocumentLibraryForm</New>
-</FormTemplates>
+<file path=customXml/item2.xml><?xml version="1.0" encoding="utf-8"?>
+<b:Sources xmlns:b="http://schemas.openxmlformats.org/officeDocument/2006/bibliography" xmlns="http://schemas.openxmlformats.org/officeDocument/2006/bibliography" SelectedStyle="\APASixthEditionOfficeOnline.xsl" StyleName="APA" Version="6"/>
 </file>
 
-<file path=customXml/item4.xml><?xml version="1.0" encoding="utf-8"?>
+<file path=customXml/item3.xml><?xml version="1.0" encoding="utf-8"?>
 <ct:contentTypeSchema xmlns:ct="http://schemas.microsoft.com/office/2006/metadata/contentType" xmlns:ma="http://schemas.microsoft.com/office/2006/metadata/properties/metaAttributes" ct:_="" ma:_="" ma:contentTypeName="Document" ma:contentTypeID="0x010100074FAAA7972F9643A241C47A4640F77B" ma:contentTypeVersion="4" ma:contentTypeDescription="Create a new document." ma:contentTypeScope="" ma:versionID="beb1a33ce099b8336a535a8070a49028">
   <xsd:schema xmlns:xsd="http://www.w3.org/2001/XMLSchema" xmlns:xs="http://www.w3.org/2001/XMLSchema" xmlns:p="http://schemas.microsoft.com/office/2006/metadata/properties" xmlns:ns2="e3bcef54-3dd5-4c54-ac74-22a6c715abc5" targetNamespace="http://schemas.microsoft.com/office/2006/metadata/properties" ma:root="true" ma:fieldsID="39dc725c7e5b7c9c602767014e9452a2" ns2:_="">
     <xsd:import namespace="e3bcef54-3dd5-4c54-ac74-22a6c715abc5"/>
@@ -7830,15 +7940,16 @@
 </ct:contentTypeSchema>
 </file>
 
-<file path=customXml/itemProps1.xml><?xml version="1.0" encoding="utf-8"?>
-<ds:datastoreItem xmlns:ds="http://schemas.openxmlformats.org/officeDocument/2006/customXml" ds:itemID="{F5997309-FACA-442A-8A47-89BAD725A418}">
-  <ds:schemaRefs>
-    <ds:schemaRef ds:uri="http://schemas.openxmlformats.org/officeDocument/2006/bibliography"/>
-  </ds:schemaRefs>
-</ds:datastoreItem>
+<file path=customXml/item4.xml><?xml version="1.0" encoding="utf-8"?>
+<?mso-contentType ?>
+<FormTemplates xmlns="http://schemas.microsoft.com/sharepoint/v3/contenttype/forms">
+  <Display>DocumentLibraryForm</Display>
+  <Edit>DocumentLibraryForm</Edit>
+  <New>DocumentLibraryForm</New>
+</FormTemplates>
 </file>
 
-<file path=customXml/itemProps2.xml><?xml version="1.0" encoding="utf-8"?>
+<file path=customXml/itemProps1.xml><?xml version="1.0" encoding="utf-8"?>
 <ds:datastoreItem xmlns:ds="http://schemas.openxmlformats.org/officeDocument/2006/customXml" ds:itemID="{6367B603-3B12-42EB-A71C-92DF23C6A36D}">
   <ds:schemaRefs>
     <ds:schemaRef ds:uri="http://schemas.microsoft.com/office/2006/metadata/properties"/>
@@ -7847,15 +7958,15 @@
 </ds:datastoreItem>
 </file>
 
-<file path=customXml/itemProps3.xml><?xml version="1.0" encoding="utf-8"?>
-<ds:datastoreItem xmlns:ds="http://schemas.openxmlformats.org/officeDocument/2006/customXml" ds:itemID="{1EF956C6-2A7C-438B-ACF2-9A85252697A5}">
+<file path=customXml/itemProps2.xml><?xml version="1.0" encoding="utf-8"?>
+<ds:datastoreItem xmlns:ds="http://schemas.openxmlformats.org/officeDocument/2006/customXml" ds:itemID="{F5997309-FACA-442A-8A47-89BAD725A418}">
   <ds:schemaRefs>
-    <ds:schemaRef ds:uri="http://schemas.microsoft.com/sharepoint/v3/contenttype/forms"/>
+    <ds:schemaRef ds:uri="http://schemas.openxmlformats.org/officeDocument/2006/bibliography"/>
   </ds:schemaRefs>
 </ds:datastoreItem>
 </file>
 
-<file path=customXml/itemProps4.xml><?xml version="1.0" encoding="utf-8"?>
+<file path=customXml/itemProps3.xml><?xml version="1.0" encoding="utf-8"?>
 <ds:datastoreItem xmlns:ds="http://schemas.openxmlformats.org/officeDocument/2006/customXml" ds:itemID="{8E875218-91D6-4204-B3E1-4F4C6E078F42}">
   <ds:schemaRefs>
     <ds:schemaRef ds:uri="http://schemas.microsoft.com/office/2006/metadata/contentType"/>
@@ -7871,4 +7982,12 @@
     <ds:schemaRef ds:uri="http://schemas.microsoft.com/internal/obd"/>
   </ds:schemaRefs>
 </ds:datastoreItem>
+</file>
+
+<file path=customXml/itemProps4.xml><?xml version="1.0" encoding="utf-8"?>
+<ds:datastoreItem xmlns:ds="http://schemas.openxmlformats.org/officeDocument/2006/customXml" ds:itemID="{1EF956C6-2A7C-438B-ACF2-9A85252697A5}">
+  <ds:schemaRefs>
+    <ds:schemaRef ds:uri="http://schemas.microsoft.com/sharepoint/v3/contenttype/forms"/>
+  </ds:schemaRefs>
+</ds:datastoreItem>
 </file>
</xml_diff>